<commit_message>
Ajout initialisation des donnees
</commit_message>
<xml_diff>
--- a/MEMOIRE/Fiche_suivi_mémoire_edutrack.docx
+++ b/MEMOIRE/Fiche_suivi_mémoire_edutrack.docx
@@ -2852,7 +2852,13 @@
               <w:rPr>
                 <w:rFonts w:asciiTheme="minorHAnsi" w:hAnsiTheme="minorHAnsi" w:cstheme="minorHAnsi"/>
               </w:rPr>
-              <w:t xml:space="preserve">Finalisation du mot du directeur </w:t>
+              <w:t>Réunion en présentiel</w:t>
+            </w:r>
+            <w:r>
+              <w:rPr>
+                <w:rFonts w:asciiTheme="minorHAnsi" w:hAnsiTheme="minorHAnsi" w:cstheme="minorHAnsi"/>
+              </w:rPr>
+              <w:t xml:space="preserve"> </w:t>
             </w:r>
           </w:p>
           <w:p>
@@ -2873,7 +2879,7 @@
               <w:rPr>
                 <w:rFonts w:asciiTheme="minorHAnsi" w:hAnsiTheme="minorHAnsi" w:cstheme="minorHAnsi"/>
               </w:rPr>
-              <w:t xml:space="preserve">Ajout de la photo du directeur </w:t>
+              <w:t xml:space="preserve">Améliorer la présentation </w:t>
             </w:r>
           </w:p>
         </w:tc>
@@ -2901,7 +2907,6 @@
                 <w:spacing w:val="-2"/>
               </w:rPr>
             </w:pPr>
-            <w:proofErr w:type="spellStart"/>
             <w:r>
               <w:rPr>
                 <w:rFonts w:ascii="Cambria" w:hAnsi="Cambria"/>
@@ -2920,16 +2925,6 @@
               </w:rPr>
               <w:t>r</w:t>
             </w:r>
-            <w:r>
-              <w:rPr>
-                <w:rFonts w:ascii="Cambria" w:hAnsi="Cambria"/>
-                <w:b/>
-                <w:bCs/>
-                <w:spacing w:val="-2"/>
-              </w:rPr>
-              <w:t>r</w:t>
-            </w:r>
-            <w:proofErr w:type="spellEnd"/>
           </w:p>
           <w:p>
             <w:pPr>
@@ -8583,6 +8578,7 @@
   <w:style w:type="character" w:default="1" w:styleId="Policepardfaut">
     <w:name w:val="Default Paragraph Font"/>
     <w:uiPriority w:val="1"/>
+    <w:semiHidden/>
     <w:unhideWhenUsed/>
   </w:style>
   <w:style w:type="table" w:default="1" w:styleId="TableauNormal">

</xml_diff>